<commit_message>
Corrigir nome fantasia da CONTRATANTE para Medicine no Anexo I
O Anexo I referia-se à CONTRATANTE como "Medicina Cursos", nome herdado
do bloco de assinatura do contrato e da Proposta 003/2026. O nome
fantasia correto do cliente é Medicine.

Substituído nos 5 pontos do documento: título da página, linha de
referência do cabeçalho, qualificação das Partes, bloco de assinatura e
rodapé — em roadmap_anexo.html e roadmap_anexo.docx (incluindo os
metadados do documento).

A razão social Med Cine Editora e Filmagem Ltda e o CNPJ
07.050.619/0001-50 permanecem como constam do preâmbulo do contrato
assinado, que é o único ponto com qualificação cadastral completa
(CNPJ, inscrição estadual, inscrição municipal e endereço).

Co-Authored-By: Claude Opus 5 <noreply@anthropic.com>
Claude-Session: https://claude.ai/code/session_01XdRC2AsPFWmvuwXgLmnzef
</commit_message>
<xml_diff>
--- a/roadmap_anexo.docx
+++ b/roadmap_anexo.docx
@@ -34,7 +34,7 @@
       </w:pPr>
       <w:r>
         <w:rPr/>
-        <w:t>Proposta Comercial 003/2026  |  Medicina Cursos × Tudo Mudou!  |  14.05.2026</w:t>
+        <w:t>Proposta Comercial 003/2026  |  Medicine × Tudo Mudou!  |  14.05.2026</w:t>
       </w:r>
     </w:p>
     <w:p>
@@ -69,7 +69,7 @@
         <w:rPr>
           <w:sz w:val="21"/>
         </w:rPr>
-        <w:t xml:space="preserve"> Med Cine Editora e Filmagem Ltda (Medicina Cursos) — CNPJ: 07.050.619/0001-50</w:t>
+        <w:t xml:space="preserve"> Med Cine Editora e Filmagem Ltda (Medicine) — CNPJ: 07.050.619/0001-50</w:t>
       </w:r>
     </w:p>
     <w:p>
@@ -4688,7 +4688,7 @@
           <w:bdr w:val="single" w:sz="2" w:space="5" w:color="000000"/>
         </w:rPr>
         <w:br/>
-        <w:t>Med Cine Editora e Filmagem Ltda (Medicina Cursos)</w:t>
+        <w:t>Med Cine Editora e Filmagem Ltda (Medicine)</w:t>
         <w:br/>
         <w:t>CNPJ: 07.050.619/0001-50</w:t>
         <w:br/>
@@ -4748,7 +4748,7 @@
           <w:sz w:val="18"/>
           <w:bdr w:val="single" w:sz="2" w:space="6" w:color="000000"/>
         </w:rPr>
-        <w:t xml:space="preserve">Anexo I — Roadmap de Implantação  |  Proposta 003/2026  |  Medicina Cursos × Tudo Mudou Marketing e Consultoria LTDA  |  CNPJ Contratada: 40.790.711/0001-21 </w:t>
+        <w:t xml:space="preserve">Anexo I — Roadmap de Implantação  |  Proposta 003/2026  |  Medicine × Tudo Mudou Marketing e Consultoria LTDA  |  CNPJ Contratada: 40.790.711/0001-21 </w:t>
       </w:r>
     </w:p>
     <w:sectPr>

</xml_diff>